<commit_message>
Back up research through Chapter355, fact-check corrections, synopsis audit and workspace move manifest
</commit_message>
<xml_diff>
--- a/research/editorial/sequential-review/Batch-016-Chapters-301-315.docx
+++ b/research/editorial/sequential-review/Batch-016-Chapters-301-315.docx
@@ -2,6 +2,16 @@
 <file path=word/document.xml><?xml version="1.0" encoding="utf-8"?>
 <w:document xmlns:wpc="http://schemas.microsoft.com/office/word/2010/wordprocessingCanvas" xmlns:mo="http://schemas.microsoft.com/office/mac/office/2008/main" xmlns:mc="http://schemas.openxmlformats.org/markup-compatibility/2006" xmlns:mv="urn:schemas-microsoft-com:mac:vml" xmlns:o="urn:schemas-microsoft-com:office:office" xmlns:r="http://schemas.openxmlformats.org/officeDocument/2006/relationships" xmlns:m="http://schemas.openxmlformats.org/officeDocument/2006/math" xmlns:v="urn:schemas-microsoft-com:vml" xmlns:wp14="http://schemas.microsoft.com/office/word/2010/wordprocessingDrawing" xmlns:wp="http://schemas.openxmlformats.org/drawingml/2006/wordprocessingDrawing" xmlns:w10="urn:schemas-microsoft-com:office:word" xmlns:w="http://schemas.openxmlformats.org/wordprocessingml/2006/main" xmlns:w14="http://schemas.microsoft.com/office/word/2010/wordml" xmlns:wpg="http://schemas.microsoft.com/office/word/2010/wordprocessingGroup" xmlns:wpi="http://schemas.microsoft.com/office/word/2010/wordprocessingInk" xmlns:wne="http://schemas.microsoft.com/office/word/2006/wordml" xmlns:wps="http://schemas.microsoft.com/office/word/2010/wordprocessingShape" mc:Ignorable="w14 wp14">
   <w:body>
+    <w:p>
+      <w:r>
+        <w:t>SECOND-PASS FACT-CHECK: SR-134 through SR-138 are superseded by Batch-016-Fact-Check-Addendum.md/.docx. This includes a verified external 冰爆蛊 variant, an unresolved aptitude baseline, and separate confidence for identifying an issue and selecting its repair. Original discussion below is retained as review history, not current authority.</w:t>
+      </w:r>
+    </w:p>
+    <w:p>
+      <w:r>
+        <w:t>Fact-check correction, SR-137: “Hail Gu” correctly translates the source 冰雹蛊. Retain it. The proposed replacement with 冰爆蛊 is suspended; the difference from nearby ice-detonation passages is an unresolved source-name query, not a demonstrated translation error. Earlier “very high” confidence is withdrawn.</w:t>
+      </w:r>
+    </w:p>
     <w:p>
       <w:pPr>
         <w:pStyle w:val="Title"/>
@@ -295,7 +305,7 @@
           </w:tcPr>
           <w:p>
             <w:r>
-              <w:t>Hail Gu named for an ice-detonation effect</w:t>
+              <w:t>Source-name consistency query, not a translation error</w:t>
             </w:r>
           </w:p>
         </w:tc>
@@ -305,7 +315,7 @@
           </w:tcPr>
           <w:p>
             <w:r>
-              <w:t>冰雹蛊 → 冰爆蛊</w:t>
+              <w:t>Retain Hail Gu; replacement suspended</w:t>
             </w:r>
           </w:p>
         </w:tc>
@@ -315,7 +325,7 @@
           </w:tcPr>
           <w:p>
             <w:r>
-              <w:t>Very high</w:t>
+              <w:t>Emendation unconfirmed</w:t>
             </w:r>
           </w:p>
         </w:tc>
@@ -705,16 +715,7 @@
     </w:p>
     <w:p>
       <w:r>
-        <w:t xml:space="preserve">The proposed effect is detonating icicles.299 already defines Ice Explosion Gu, and313 explicitly uses it for this purpose. Preferred </w:t>
-      </w:r>
-      <w:r>
-        <w:rPr>
-          <w:b/>
-        </w:rPr>
-        <w:t>冰雹蛊 → 冰爆蛊</w:t>
-      </w:r>
-      <w:r>
-        <w:t xml:space="preserve"> at312p97. This does not license merging all ice-type names: the older Frost Spit and later Frost Breath labels may reflect a replacement or naming drift across the long interval and remain separately tracked.</w:t>
+        <w:t>The proposed effect is detonating icicles.299 already defines Ice Explosion Gu, and313 explicitly uses it for this purpose. Replacement suspended: retain 冰雹蛊 / Hail Gu at312p97. This does not license merging all ice-type names: the older Frost Spit and later Frost Breath labels may reflect a replacement or naming drift across the long interval and remain separately tracked.</w:t>
       </w:r>
     </w:p>
     <w:p>

</xml_diff>